<commit_message>
Update Day 5 document
Refreshes the Day 5 Word document and removes stray temporary Word files from the directory.
</commit_message>
<xml_diff>
--- a/Day 5/Day5.docx
+++ b/Day 5/Day5.docx
@@ -950,6 +950,9 @@
           <w:tab w:val="left" w:pos="6602"/>
         </w:tabs>
       </w:pPr>
+      <w:r>
+        <w:t>Generally, picking with replacement makes each pick independent of each other pick, while picking without replacement makes each pick dependent on all previous picks.</w:t>
+      </w:r>
     </w:p>
     <w:p>
       <w:pPr>
@@ -959,7 +962,82 @@
         </w:tabs>
       </w:pPr>
       <w:r>
-        <w:t xml:space="preserve">Generally, </w:t>
+        <w:t>However, if the number of things to pick from is much larger than the number of them we are picking, we often assume independence for simplicity, even when choosing without replacement.</w:t>
+      </w:r>
+    </w:p>
+    <w:p>
+      <w:pPr>
+        <w:tabs>
+          <w:tab w:val="center" w:pos="4680"/>
+          <w:tab w:val="left" w:pos="6602"/>
+        </w:tabs>
+      </w:pPr>
+      <w:r>
+        <w:rPr>
+          <w:b/>
+          <w:bCs/>
+        </w:rPr>
+        <w:t>Example</w:t>
+      </w:r>
+      <w:r>
+        <w:t xml:space="preserve">: </w:t>
+      </w:r>
+      <w:r>
+        <w:t>At a university with tens of thousands of students, 15% are graduate students.</w:t>
+      </w:r>
+    </w:p>
+    <w:p>
+      <w:pPr>
+        <w:tabs>
+          <w:tab w:val="center" w:pos="4680"/>
+          <w:tab w:val="left" w:pos="6602"/>
+        </w:tabs>
+      </w:pPr>
+      <w:r>
+        <w:t>You choose 3 students at random from this population. What is the probability they are all graduate students?</w:t>
+      </w:r>
+    </w:p>
+    <w:p>
+      <w:pPr>
+        <w:tabs>
+          <w:tab w:val="center" w:pos="4680"/>
+          <w:tab w:val="left" w:pos="6602"/>
+        </w:tabs>
+      </w:pPr>
+      <w:r>
+        <w:t>≈</w:t>
+      </w:r>
+      <w:r>
+        <w:t xml:space="preserve"> P(grad 1st) * P(grad 2nd) * P(grad 3rd)</w:t>
+      </w:r>
+    </w:p>
+    <w:p>
+      <w:pPr>
+        <w:tabs>
+          <w:tab w:val="center" w:pos="4680"/>
+          <w:tab w:val="left" w:pos="6602"/>
+        </w:tabs>
+        <w:rPr>
+          <w:b/>
+          <w:bCs/>
+        </w:rPr>
+      </w:pPr>
+      <w:r>
+        <w:tab/>
+      </w:r>
+      <w:r>
+        <w:rPr>
+          <w:b/>
+          <w:bCs/>
+        </w:rPr>
+        <w:t>= 0.15 * 0.15 * 0.15 =</w:t>
+      </w:r>
+      <w:r>
+        <w:rPr>
+          <w:b/>
+          <w:bCs/>
+        </w:rPr>
+        <w:t xml:space="preserve"> 0.003375</w:t>
       </w:r>
     </w:p>
     <w:sectPr>

</xml_diff>